<commit_message>
Apply Ready for Real Life branding to formal materials
</commit_message>
<xml_diff>
--- a/docs/MMMF_CASEL_Survey.docx
+++ b/docs/MMMF_CASEL_Survey.docx
@@ -29,7 +29,7 @@
           <w:sz w:val="22"/>
           <w:szCs w:val="22"/>
         </w:rPr>
-        <w:t>Modern Manners and Mental Fortitude (</w:t>
+        <w:t>Ready for Real Life Instruction and Education (</w:t>
       </w:r>
       <w:proofErr w:type="gramStart"/>
       <w:r>
@@ -6666,7 +6666,7 @@
           <w:sz w:val="16"/>
           <w:szCs w:val="16"/>
         </w:rPr>
-        <w:t>Collaborative for Academic, Social, and Emotional Learning (CASEL) competency framework adapted for Modern Manners and Mental Fortitude (MMMF). Survey aligned to Utah College and Career Awareness (CCA) Core Standards and CASEL Social and Emotional Learning (SEL) competencies. © Michael R. Terry &amp; Mekenzi G. Terry — Protected Intellectual Property.</w:t>
+        <w:t>Collaborative for Academic, Social, and Emotional Learning (CASEL) competency framework adapted for Ready for Real Life Instruction and Education (MMMF). Survey aligned to Utah College and Career Awareness (CCA) Core Standards and CASEL Social and Emotional Learning (SEL) competencies. Ready for Real Life Instruction and Education | MMMF LLC — © Michael R. Terry &amp; Mekenzi G. Terry — Protected Intellectual Property.</w:t>
       </w:r>
     </w:p>
     <w:sectPr>
@@ -6822,7 +6822,7 @@
         <w:sz w:val="18"/>
         <w:szCs w:val="18"/>
       </w:rPr>
-      <w:t>Modern Manners and Mental Fortitude (</w:t>
+      <w:t>Ready for Real Life Instruction and Education (</w:t>
     </w:r>
     <w:proofErr w:type="gramStart"/>
     <w:r>

</xml_diff>